<commit_message>
docs: Semanas 2 - 6
</commit_message>
<xml_diff>
--- a/docs/Registro de Horas - Projeto de Extensão.docx
+++ b/docs/Registro de Horas - Projeto de Extensão.docx
@@ -148,7 +148,7 @@
           <w:rFonts w:ascii="Arial" w:hAnsi="Arial" w:cs="Arial"/>
           <w:lang w:val="pt-BR"/>
         </w:rPr>
-        <w:t>• Definição detalhada do problema e dos objetivos do projeto</w:t>
+        <w:t>Definição detalhada do problema e dos objetivos do projeto</w:t>
       </w:r>
       <w:r>
         <w:rPr>
@@ -156,7 +156,7 @@
           <w:lang w:val="pt-BR"/>
         </w:rPr>
         <w:br/>
-        <w:t>• Refinamento do escopo inicial</w:t>
+        <w:t>Refinamento do escopo inicial</w:t>
       </w:r>
       <w:r>
         <w:rPr>
@@ -164,7 +164,7 @@
           <w:lang w:val="pt-BR"/>
         </w:rPr>
         <w:br/>
-        <w:t>• Levantamento preliminar de aplicativos concorrentes</w:t>
+        <w:t>Levantamento preliminar de aplicativos concorrentes</w:t>
       </w:r>
     </w:p>
     <w:p>
@@ -173,6 +173,7 @@
           <w:rFonts w:ascii="Arial" w:hAnsi="Arial" w:cs="Arial"/>
           <w:b/>
           <w:bCs/>
+          <w:lang w:val="pt-BR"/>
         </w:rPr>
       </w:pPr>
       <w:r>
@@ -182,15 +183,7 @@
           <w:bCs/>
           <w:lang w:val="pt-BR"/>
         </w:rPr>
-        <w:t>Avanços do projeto</w:t>
-      </w:r>
-      <w:r>
-        <w:rPr>
-          <w:rFonts w:ascii="Arial" w:hAnsi="Arial" w:cs="Arial"/>
-          <w:b/>
-          <w:bCs/>
-        </w:rPr>
-        <w:t>:</w:t>
+        <w:t>Avanços do projeto:</w:t>
       </w:r>
     </w:p>
     <w:p>
@@ -217,9 +210,1236 @@
         </w:numPr>
         <w:ind w:left="360" w:hanging="360"/>
         <w:rPr>
-          <w:lang w:val="pt-BR"/>
-        </w:rPr>
-      </w:pPr>
+          <w:rFonts w:ascii="Arial" w:hAnsi="Arial" w:cs="Arial"/>
+          <w:lang w:val="pt-BR"/>
+        </w:rPr>
+      </w:pPr>
+    </w:p>
+    <w:p>
+      <w:pPr>
+        <w:rPr>
+          <w:rFonts w:ascii="Arial" w:hAnsi="Arial" w:cs="Arial"/>
+          <w:b/>
+          <w:bCs/>
+          <w:lang w:val="pt-BR"/>
+        </w:rPr>
+      </w:pPr>
+      <w:r>
+        <w:rPr>
+          <w:rFonts w:ascii="Arial" w:hAnsi="Arial" w:cs="Arial"/>
+          <w:b/>
+          <w:bCs/>
+          <w:lang w:val="pt-BR"/>
+        </w:rPr>
+        <w:t>Semana 2 (23/02 – 01/03)</w:t>
+      </w:r>
+    </w:p>
+    <w:p>
+      <w:pPr>
+        <w:pStyle w:val="Commarcadores"/>
+        <w:numPr>
+          <w:ilvl w:val="0"/>
+          <w:numId w:val="0"/>
+        </w:numPr>
+        <w:ind w:left="360" w:hanging="360"/>
+        <w:rPr>
+          <w:rFonts w:ascii="Arial" w:hAnsi="Arial" w:cs="Arial"/>
+          <w:lang w:val="pt-BR"/>
+        </w:rPr>
+      </w:pPr>
+      <w:r>
+        <w:rPr>
+          <w:rFonts w:ascii="Arial" w:hAnsi="Arial" w:cs="Arial"/>
+          <w:lang w:val="pt-BR"/>
+        </w:rPr>
+        <w:t>Total de Horas Dedicadas: 10 horas</w:t>
+      </w:r>
+    </w:p>
+    <w:p>
+      <w:pPr>
+        <w:pStyle w:val="Commarcadores"/>
+        <w:numPr>
+          <w:ilvl w:val="0"/>
+          <w:numId w:val="0"/>
+        </w:numPr>
+        <w:ind w:left="360" w:hanging="360"/>
+        <w:rPr>
+          <w:rFonts w:ascii="Arial" w:hAnsi="Arial" w:cs="Arial"/>
+          <w:lang w:val="pt-BR"/>
+        </w:rPr>
+      </w:pPr>
+    </w:p>
+    <w:p>
+      <w:pPr>
+        <w:pStyle w:val="Commarcadores"/>
+        <w:numPr>
+          <w:ilvl w:val="0"/>
+          <w:numId w:val="0"/>
+        </w:numPr>
+        <w:ind w:left="360" w:hanging="360"/>
+        <w:rPr>
+          <w:rFonts w:ascii="Arial" w:hAnsi="Arial" w:cs="Arial"/>
+          <w:b/>
+          <w:bCs/>
+          <w:lang w:val="pt-BR"/>
+        </w:rPr>
+      </w:pPr>
+      <w:r>
+        <w:rPr>
+          <w:rFonts w:ascii="Arial" w:hAnsi="Arial" w:cs="Arial"/>
+          <w:b/>
+          <w:bCs/>
+          <w:lang w:val="pt-BR"/>
+        </w:rPr>
+        <w:t>Atividades Realizadas:</w:t>
+      </w:r>
+    </w:p>
+    <w:p>
+      <w:pPr>
+        <w:pStyle w:val="Commarcadores"/>
+        <w:numPr>
+          <w:ilvl w:val="0"/>
+          <w:numId w:val="0"/>
+        </w:numPr>
+        <w:ind w:left="360" w:hanging="360"/>
+        <w:rPr>
+          <w:rFonts w:ascii="Arial" w:hAnsi="Arial" w:cs="Arial"/>
+          <w:lang w:val="pt-BR"/>
+        </w:rPr>
+      </w:pPr>
+    </w:p>
+    <w:p>
+      <w:pPr>
+        <w:pStyle w:val="Commarcadores"/>
+        <w:numPr>
+          <w:ilvl w:val="0"/>
+          <w:numId w:val="0"/>
+        </w:numPr>
+        <w:ind w:left="360" w:hanging="360"/>
+        <w:rPr>
+          <w:rFonts w:ascii="Arial" w:hAnsi="Arial" w:cs="Arial"/>
+          <w:lang w:val="pt-BR"/>
+        </w:rPr>
+      </w:pPr>
+      <w:r>
+        <w:rPr>
+          <w:rFonts w:ascii="Arial" w:hAnsi="Arial" w:cs="Arial"/>
+          <w:lang w:val="pt-BR"/>
+        </w:rPr>
+        <w:t>Pesquisa de mercado com instalação e análise de aplicativos similares</w:t>
+      </w:r>
+    </w:p>
+    <w:p>
+      <w:pPr>
+        <w:pStyle w:val="Commarcadores"/>
+        <w:numPr>
+          <w:ilvl w:val="0"/>
+          <w:numId w:val="0"/>
+        </w:numPr>
+        <w:ind w:left="360" w:hanging="360"/>
+        <w:rPr>
+          <w:rFonts w:ascii="Arial" w:hAnsi="Arial" w:cs="Arial"/>
+          <w:lang w:val="pt-BR"/>
+        </w:rPr>
+      </w:pPr>
+      <w:r>
+        <w:rPr>
+          <w:rFonts w:ascii="Arial" w:hAnsi="Arial" w:cs="Arial"/>
+          <w:lang w:val="pt-BR"/>
+        </w:rPr>
+        <w:t>Identificação de pontos fortes e fracos das plataformas existentes</w:t>
+      </w:r>
+    </w:p>
+    <w:p>
+      <w:pPr>
+        <w:pStyle w:val="Commarcadores"/>
+        <w:numPr>
+          <w:ilvl w:val="0"/>
+          <w:numId w:val="0"/>
+        </w:numPr>
+        <w:ind w:left="360" w:hanging="360"/>
+        <w:rPr>
+          <w:rFonts w:ascii="Arial" w:hAnsi="Arial" w:cs="Arial"/>
+          <w:lang w:val="pt-BR"/>
+        </w:rPr>
+      </w:pPr>
+      <w:r>
+        <w:rPr>
+          <w:rFonts w:ascii="Arial" w:hAnsi="Arial" w:cs="Arial"/>
+          <w:lang w:val="pt-BR"/>
+        </w:rPr>
+        <w:t>Avaliação da experiência individual versus coletiva</w:t>
+      </w:r>
+    </w:p>
+    <w:p>
+      <w:pPr>
+        <w:pStyle w:val="Commarcadores"/>
+        <w:numPr>
+          <w:ilvl w:val="0"/>
+          <w:numId w:val="0"/>
+        </w:numPr>
+        <w:ind w:left="360" w:hanging="360"/>
+        <w:rPr>
+          <w:rFonts w:ascii="Arial" w:hAnsi="Arial" w:cs="Arial"/>
+          <w:lang w:val="pt-BR"/>
+        </w:rPr>
+      </w:pPr>
+    </w:p>
+    <w:p>
+      <w:pPr>
+        <w:pStyle w:val="Commarcadores"/>
+        <w:numPr>
+          <w:ilvl w:val="0"/>
+          <w:numId w:val="0"/>
+        </w:numPr>
+        <w:ind w:left="360" w:hanging="360"/>
+        <w:rPr>
+          <w:rFonts w:ascii="Arial" w:hAnsi="Arial" w:cs="Arial"/>
+          <w:b/>
+          <w:bCs/>
+          <w:lang w:val="pt-BR"/>
+        </w:rPr>
+      </w:pPr>
+      <w:r>
+        <w:rPr>
+          <w:rFonts w:ascii="Arial" w:hAnsi="Arial" w:cs="Arial"/>
+          <w:b/>
+          <w:bCs/>
+          <w:lang w:val="pt-BR"/>
+        </w:rPr>
+        <w:t>Avanços do projeto:</w:t>
+      </w:r>
+    </w:p>
+    <w:p>
+      <w:pPr>
+        <w:rPr>
+          <w:rFonts w:ascii="Arial" w:hAnsi="Arial" w:cs="Arial"/>
+          <w:lang w:val="pt-BR"/>
+        </w:rPr>
+      </w:pPr>
+      <w:r>
+        <w:rPr>
+          <w:rFonts w:ascii="Arial" w:hAnsi="Arial" w:cs="Arial"/>
+          <w:lang w:val="pt-BR"/>
+        </w:rPr>
+        <w:t>Compreensão aprofundada do cenário atual e identificação de oportunidades para diferenciação da solução proposta.</w:t>
+      </w:r>
+    </w:p>
+    <w:p>
+      <w:pPr>
+        <w:pStyle w:val="Commarcadores"/>
+        <w:numPr>
+          <w:ilvl w:val="0"/>
+          <w:numId w:val="0"/>
+        </w:numPr>
+        <w:ind w:left="360" w:hanging="360"/>
+        <w:rPr>
+          <w:rFonts w:ascii="Arial" w:hAnsi="Arial" w:cs="Arial"/>
+          <w:lang w:val="pt-BR"/>
+        </w:rPr>
+      </w:pPr>
+    </w:p>
+    <w:p>
+      <w:pPr>
+        <w:pStyle w:val="Commarcadores"/>
+        <w:numPr>
+          <w:ilvl w:val="0"/>
+          <w:numId w:val="0"/>
+        </w:numPr>
+        <w:ind w:left="360" w:hanging="360"/>
+        <w:rPr>
+          <w:rFonts w:ascii="Arial" w:hAnsi="Arial" w:cs="Arial"/>
+          <w:lang w:val="pt-BR"/>
+        </w:rPr>
+      </w:pPr>
+    </w:p>
+    <w:p>
+      <w:pPr>
+        <w:pStyle w:val="Commarcadores"/>
+        <w:numPr>
+          <w:ilvl w:val="0"/>
+          <w:numId w:val="0"/>
+        </w:numPr>
+        <w:ind w:left="360" w:hanging="360"/>
+        <w:rPr>
+          <w:rFonts w:ascii="Arial" w:hAnsi="Arial" w:cs="Arial"/>
+          <w:lang w:val="pt-BR"/>
+        </w:rPr>
+      </w:pPr>
+    </w:p>
+    <w:p>
+      <w:pPr>
+        <w:pStyle w:val="Commarcadores"/>
+        <w:numPr>
+          <w:ilvl w:val="0"/>
+          <w:numId w:val="0"/>
+        </w:numPr>
+        <w:ind w:left="360" w:hanging="360"/>
+        <w:rPr>
+          <w:rFonts w:ascii="Arial" w:hAnsi="Arial" w:cs="Arial"/>
+          <w:lang w:val="pt-BR"/>
+        </w:rPr>
+      </w:pPr>
+    </w:p>
+    <w:p>
+      <w:pPr>
+        <w:pStyle w:val="Commarcadores"/>
+        <w:numPr>
+          <w:ilvl w:val="0"/>
+          <w:numId w:val="0"/>
+        </w:numPr>
+        <w:ind w:left="360" w:hanging="360"/>
+        <w:rPr>
+          <w:rFonts w:ascii="Arial" w:hAnsi="Arial" w:cs="Arial"/>
+          <w:lang w:val="pt-BR"/>
+        </w:rPr>
+      </w:pPr>
+    </w:p>
+    <w:p>
+      <w:pPr>
+        <w:rPr>
+          <w:rFonts w:ascii="Arial" w:hAnsi="Arial" w:cs="Arial"/>
+          <w:lang w:val="pt-BR"/>
+        </w:rPr>
+      </w:pPr>
+    </w:p>
+    <w:p>
+      <w:pPr>
+        <w:spacing w:after="0"/>
+        <w:rPr>
+          <w:rFonts w:ascii="Arial" w:hAnsi="Arial" w:cs="Arial"/>
+          <w:lang w:val="pt-BR"/>
+        </w:rPr>
+      </w:pPr>
+      <w:r>
+        <w:rPr>
+          <w:rFonts w:ascii="Arial" w:hAnsi="Arial" w:cs="Arial"/>
+          <w:b/>
+          <w:lang w:val="pt-BR"/>
+        </w:rPr>
+        <w:lastRenderedPageBreak/>
+        <w:t>Semana 3 (02/03 – 08/03)</w:t>
+      </w:r>
+    </w:p>
+    <w:p>
+      <w:pPr>
+        <w:spacing w:after="0"/>
+        <w:rPr>
+          <w:rFonts w:ascii="Arial" w:hAnsi="Arial" w:cs="Arial"/>
+          <w:lang w:val="pt-BR"/>
+        </w:rPr>
+      </w:pPr>
+    </w:p>
+    <w:p>
+      <w:pPr>
+        <w:spacing w:after="0"/>
+        <w:rPr>
+          <w:rFonts w:ascii="Arial" w:hAnsi="Arial" w:cs="Arial"/>
+          <w:lang w:val="pt-BR"/>
+        </w:rPr>
+      </w:pPr>
+      <w:r>
+        <w:rPr>
+          <w:rFonts w:ascii="Arial" w:hAnsi="Arial" w:cs="Arial"/>
+          <w:lang w:val="pt-BR"/>
+        </w:rPr>
+        <w:t>Total de Horas Dedicadas: 10 horas</w:t>
+      </w:r>
+    </w:p>
+    <w:p>
+      <w:pPr>
+        <w:spacing w:after="0"/>
+        <w:rPr>
+          <w:rFonts w:ascii="Arial" w:hAnsi="Arial" w:cs="Arial"/>
+          <w:lang w:val="pt-BR"/>
+        </w:rPr>
+      </w:pPr>
+    </w:p>
+    <w:p>
+      <w:pPr>
+        <w:spacing w:after="0"/>
+        <w:rPr>
+          <w:rFonts w:ascii="Arial" w:hAnsi="Arial" w:cs="Arial"/>
+          <w:lang w:val="pt-BR"/>
+        </w:rPr>
+      </w:pPr>
+      <w:r>
+        <w:rPr>
+          <w:rFonts w:ascii="Arial" w:hAnsi="Arial" w:cs="Arial"/>
+          <w:b/>
+          <w:lang w:val="pt-BR"/>
+        </w:rPr>
+        <w:t>Atividades Realizadas:</w:t>
+      </w:r>
+    </w:p>
+    <w:p>
+      <w:pPr>
+        <w:spacing w:after="0"/>
+        <w:rPr>
+          <w:rFonts w:ascii="Arial" w:hAnsi="Arial" w:cs="Arial"/>
+          <w:lang w:val="pt-BR"/>
+        </w:rPr>
+      </w:pPr>
+    </w:p>
+    <w:p>
+      <w:pPr>
+        <w:spacing w:after="0"/>
+        <w:rPr>
+          <w:rFonts w:ascii="Arial" w:hAnsi="Arial" w:cs="Arial"/>
+          <w:lang w:val="pt-BR"/>
+        </w:rPr>
+      </w:pPr>
+      <w:r>
+        <w:rPr>
+          <w:rFonts w:ascii="Arial" w:hAnsi="Arial" w:cs="Arial"/>
+          <w:lang w:val="pt-BR"/>
+        </w:rPr>
+        <w:t>Continuação da pesquisa comparativa</w:t>
+      </w:r>
+    </w:p>
+    <w:p>
+      <w:pPr>
+        <w:spacing w:after="0"/>
+        <w:rPr>
+          <w:rFonts w:ascii="Arial" w:hAnsi="Arial" w:cs="Arial"/>
+          <w:lang w:val="pt-BR"/>
+        </w:rPr>
+      </w:pPr>
+      <w:r>
+        <w:rPr>
+          <w:rFonts w:ascii="Arial" w:hAnsi="Arial" w:cs="Arial"/>
+          <w:lang w:val="pt-BR"/>
+        </w:rPr>
+        <w:t>Análise de funcionalidades (clubes, fóruns, eventos, enquetes)</w:t>
+      </w:r>
+    </w:p>
+    <w:p>
+      <w:pPr>
+        <w:spacing w:after="0"/>
+        <w:rPr>
+          <w:rFonts w:ascii="Arial" w:hAnsi="Arial" w:cs="Arial"/>
+          <w:lang w:val="pt-BR"/>
+        </w:rPr>
+      </w:pPr>
+      <w:r>
+        <w:rPr>
+          <w:rFonts w:ascii="Arial" w:hAnsi="Arial" w:cs="Arial"/>
+          <w:lang w:val="pt-BR"/>
+        </w:rPr>
+        <w:t>Construção de matriz comparativa entre plataformas</w:t>
+      </w:r>
+    </w:p>
+    <w:p>
+      <w:pPr>
+        <w:spacing w:after="0"/>
+        <w:rPr>
+          <w:rFonts w:ascii="Arial" w:hAnsi="Arial" w:cs="Arial"/>
+          <w:lang w:val="pt-BR"/>
+        </w:rPr>
+      </w:pPr>
+    </w:p>
+    <w:p>
+      <w:pPr>
+        <w:spacing w:after="0"/>
+        <w:rPr>
+          <w:rFonts w:ascii="Arial" w:hAnsi="Arial" w:cs="Arial"/>
+          <w:lang w:val="pt-BR"/>
+        </w:rPr>
+      </w:pPr>
+      <w:r>
+        <w:rPr>
+          <w:rFonts w:ascii="Arial" w:hAnsi="Arial" w:cs="Arial"/>
+          <w:b/>
+          <w:lang w:val="pt-BR"/>
+        </w:rPr>
+        <w:t>Avanços do projeto:</w:t>
+      </w:r>
+    </w:p>
+    <w:p>
+      <w:pPr>
+        <w:spacing w:after="0"/>
+        <w:rPr>
+          <w:rFonts w:ascii="Arial" w:hAnsi="Arial" w:cs="Arial"/>
+          <w:lang w:val="pt-BR"/>
+        </w:rPr>
+      </w:pPr>
+    </w:p>
+    <w:p>
+      <w:pPr>
+        <w:spacing w:after="0"/>
+        <w:rPr>
+          <w:rFonts w:ascii="Arial" w:hAnsi="Arial" w:cs="Arial"/>
+          <w:lang w:val="pt-BR"/>
+        </w:rPr>
+      </w:pPr>
+      <w:r>
+        <w:rPr>
+          <w:rFonts w:ascii="Arial" w:hAnsi="Arial" w:cs="Arial"/>
+          <w:lang w:val="pt-BR"/>
+        </w:rPr>
+        <w:t>Identificação das principais funcionalidades do mercado e definição de direcionamentos para o escopo do MVP.</w:t>
+      </w:r>
+    </w:p>
+    <w:p>
+      <w:pPr>
+        <w:spacing w:after="0"/>
+        <w:rPr>
+          <w:rFonts w:ascii="Arial" w:hAnsi="Arial" w:cs="Arial"/>
+          <w:lang w:val="pt-BR"/>
+        </w:rPr>
+      </w:pPr>
+    </w:p>
+    <w:p>
+      <w:pPr>
+        <w:spacing w:after="0"/>
+        <w:rPr>
+          <w:rFonts w:ascii="Arial" w:hAnsi="Arial" w:cs="Arial"/>
+          <w:lang w:val="pt-BR"/>
+        </w:rPr>
+      </w:pPr>
+      <w:r>
+        <w:rPr>
+          <w:rFonts w:ascii="Arial" w:hAnsi="Arial" w:cs="Arial"/>
+          <w:b/>
+          <w:lang w:val="pt-BR"/>
+        </w:rPr>
+        <w:t>Semana 4 (09/03 – 15/03)</w:t>
+      </w:r>
+    </w:p>
+    <w:p>
+      <w:pPr>
+        <w:spacing w:after="0"/>
+        <w:rPr>
+          <w:rFonts w:ascii="Arial" w:hAnsi="Arial" w:cs="Arial"/>
+          <w:lang w:val="pt-BR"/>
+        </w:rPr>
+      </w:pPr>
+    </w:p>
+    <w:p>
+      <w:pPr>
+        <w:spacing w:after="0"/>
+        <w:rPr>
+          <w:rFonts w:ascii="Arial" w:hAnsi="Arial" w:cs="Arial"/>
+          <w:lang w:val="pt-BR"/>
+        </w:rPr>
+      </w:pPr>
+      <w:r>
+        <w:rPr>
+          <w:rFonts w:ascii="Arial" w:hAnsi="Arial" w:cs="Arial"/>
+          <w:lang w:val="pt-BR"/>
+        </w:rPr>
+        <w:t>Total de Horas Dedicadas: 10 horas</w:t>
+      </w:r>
+    </w:p>
+    <w:p>
+      <w:pPr>
+        <w:spacing w:after="0"/>
+        <w:rPr>
+          <w:rFonts w:ascii="Arial" w:hAnsi="Arial" w:cs="Arial"/>
+          <w:lang w:val="pt-BR"/>
+        </w:rPr>
+      </w:pPr>
+    </w:p>
+    <w:p>
+      <w:pPr>
+        <w:spacing w:after="0"/>
+        <w:rPr>
+          <w:rFonts w:ascii="Arial" w:hAnsi="Arial" w:cs="Arial"/>
+          <w:lang w:val="pt-BR"/>
+        </w:rPr>
+      </w:pPr>
+      <w:r>
+        <w:rPr>
+          <w:rFonts w:ascii="Arial" w:hAnsi="Arial" w:cs="Arial"/>
+          <w:b/>
+          <w:lang w:val="pt-BR"/>
+        </w:rPr>
+        <w:t>Atividades Realizadas:</w:t>
+      </w:r>
+    </w:p>
+    <w:p>
+      <w:pPr>
+        <w:spacing w:after="0"/>
+        <w:rPr>
+          <w:rFonts w:ascii="Arial" w:hAnsi="Arial" w:cs="Arial"/>
+          <w:lang w:val="pt-BR"/>
+        </w:rPr>
+      </w:pPr>
+    </w:p>
+    <w:p>
+      <w:pPr>
+        <w:spacing w:after="0"/>
+        <w:rPr>
+          <w:rFonts w:ascii="Arial" w:hAnsi="Arial" w:cs="Arial"/>
+          <w:lang w:val="pt-BR"/>
+        </w:rPr>
+      </w:pPr>
+      <w:r>
+        <w:rPr>
+          <w:rFonts w:ascii="Arial" w:hAnsi="Arial" w:cs="Arial"/>
+          <w:lang w:val="pt-BR"/>
+        </w:rPr>
+        <w:t xml:space="preserve">Criação de questionário no Google </w:t>
+      </w:r>
+      <w:proofErr w:type="spellStart"/>
+      <w:r>
+        <w:rPr>
+          <w:rFonts w:ascii="Arial" w:hAnsi="Arial" w:cs="Arial"/>
+          <w:lang w:val="pt-BR"/>
+        </w:rPr>
+        <w:t>Forms</w:t>
+      </w:r>
+      <w:proofErr w:type="spellEnd"/>
+    </w:p>
+    <w:p>
+      <w:pPr>
+        <w:spacing w:after="0"/>
+        <w:rPr>
+          <w:rFonts w:ascii="Arial" w:hAnsi="Arial" w:cs="Arial"/>
+          <w:lang w:val="pt-BR"/>
+        </w:rPr>
+      </w:pPr>
+      <w:r>
+        <w:rPr>
+          <w:rFonts w:ascii="Arial" w:hAnsi="Arial" w:cs="Arial"/>
+          <w:lang w:val="pt-BR"/>
+        </w:rPr>
+        <w:t>Coleta e análise inicial de dados</w:t>
+      </w:r>
+    </w:p>
+    <w:p>
+      <w:pPr>
+        <w:spacing w:after="0"/>
+        <w:rPr>
+          <w:rFonts w:ascii="Arial" w:hAnsi="Arial" w:cs="Arial"/>
+          <w:lang w:val="pt-BR"/>
+        </w:rPr>
+      </w:pPr>
+      <w:r>
+        <w:rPr>
+          <w:rFonts w:ascii="Arial" w:hAnsi="Arial" w:cs="Arial"/>
+          <w:lang w:val="pt-BR"/>
+        </w:rPr>
+        <w:t>Identificação de dores e necessidades das usuárias</w:t>
+      </w:r>
+    </w:p>
+    <w:p>
+      <w:pPr>
+        <w:spacing w:after="0"/>
+        <w:rPr>
+          <w:rFonts w:ascii="Arial" w:hAnsi="Arial" w:cs="Arial"/>
+          <w:lang w:val="pt-BR"/>
+        </w:rPr>
+      </w:pPr>
+      <w:r>
+        <w:rPr>
+          <w:rFonts w:ascii="Arial" w:hAnsi="Arial" w:cs="Arial"/>
+          <w:lang w:val="pt-BR"/>
+        </w:rPr>
+        <w:t>Definição inicial das personas</w:t>
+      </w:r>
+    </w:p>
+    <w:p>
+      <w:pPr>
+        <w:spacing w:after="0"/>
+        <w:rPr>
+          <w:rFonts w:ascii="Arial" w:hAnsi="Arial" w:cs="Arial"/>
+          <w:lang w:val="pt-BR"/>
+        </w:rPr>
+      </w:pPr>
+      <w:r>
+        <w:rPr>
+          <w:rFonts w:ascii="Arial" w:hAnsi="Arial" w:cs="Arial"/>
+          <w:lang w:val="pt-BR"/>
+        </w:rPr>
+        <w:t>Construção da jornada do usuário (situação atual e proposta)</w:t>
+      </w:r>
+    </w:p>
+    <w:p>
+      <w:pPr>
+        <w:spacing w:after="0"/>
+        <w:rPr>
+          <w:rFonts w:ascii="Arial" w:hAnsi="Arial" w:cs="Arial"/>
+          <w:lang w:val="pt-BR"/>
+        </w:rPr>
+      </w:pPr>
+    </w:p>
+    <w:p>
+      <w:pPr>
+        <w:spacing w:after="0"/>
+        <w:rPr>
+          <w:rFonts w:ascii="Arial" w:hAnsi="Arial" w:cs="Arial"/>
+          <w:lang w:val="pt-BR"/>
+        </w:rPr>
+      </w:pPr>
+      <w:r>
+        <w:rPr>
+          <w:rFonts w:ascii="Arial" w:hAnsi="Arial" w:cs="Arial"/>
+          <w:b/>
+          <w:lang w:val="pt-BR"/>
+        </w:rPr>
+        <w:t>Avanços do projeto:</w:t>
+      </w:r>
+    </w:p>
+    <w:p>
+      <w:pPr>
+        <w:spacing w:after="0"/>
+        <w:rPr>
+          <w:rFonts w:ascii="Arial" w:hAnsi="Arial" w:cs="Arial"/>
+          <w:lang w:val="pt-BR"/>
+        </w:rPr>
+      </w:pPr>
+    </w:p>
+    <w:p>
+      <w:pPr>
+        <w:spacing w:after="0"/>
+        <w:rPr>
+          <w:rFonts w:ascii="Arial" w:hAnsi="Arial" w:cs="Arial"/>
+          <w:lang w:val="pt-BR"/>
+        </w:rPr>
+      </w:pPr>
+      <w:r>
+        <w:rPr>
+          <w:rFonts w:ascii="Arial" w:hAnsi="Arial" w:cs="Arial"/>
+          <w:lang w:val="pt-BR"/>
+        </w:rPr>
+        <w:t>Validação do problema com base em dados coletados junto ao público-alvo e definição inicial da experiência do usuário para orientar o desenvolvimento do sistema.</w:t>
+      </w:r>
+    </w:p>
+    <w:p>
+      <w:pPr>
+        <w:spacing w:after="0"/>
+        <w:rPr>
+          <w:rFonts w:ascii="Arial" w:hAnsi="Arial" w:cs="Arial"/>
+          <w:lang w:val="pt-BR"/>
+        </w:rPr>
+      </w:pPr>
+    </w:p>
+    <w:p>
+      <w:pPr>
+        <w:spacing w:after="0"/>
+        <w:rPr>
+          <w:rFonts w:ascii="Arial" w:hAnsi="Arial" w:cs="Arial"/>
+          <w:lang w:val="pt-BR"/>
+        </w:rPr>
+      </w:pPr>
+    </w:p>
+    <w:p>
+      <w:pPr>
+        <w:spacing w:after="0"/>
+        <w:rPr>
+          <w:rFonts w:ascii="Arial" w:hAnsi="Arial" w:cs="Arial"/>
+          <w:lang w:val="pt-BR"/>
+        </w:rPr>
+      </w:pPr>
+    </w:p>
+    <w:p>
+      <w:pPr>
+        <w:spacing w:after="0"/>
+        <w:rPr>
+          <w:rFonts w:ascii="Arial" w:hAnsi="Arial" w:cs="Arial"/>
+          <w:lang w:val="pt-BR"/>
+        </w:rPr>
+      </w:pPr>
+    </w:p>
+    <w:p>
+      <w:pPr>
+        <w:spacing w:after="0"/>
+        <w:rPr>
+          <w:rFonts w:ascii="Arial" w:hAnsi="Arial" w:cs="Arial"/>
+          <w:lang w:val="pt-BR"/>
+        </w:rPr>
+      </w:pPr>
+    </w:p>
+    <w:p>
+      <w:pPr>
+        <w:spacing w:after="0"/>
+        <w:rPr>
+          <w:rFonts w:ascii="Arial" w:hAnsi="Arial" w:cs="Arial"/>
+          <w:lang w:val="pt-BR"/>
+        </w:rPr>
+      </w:pPr>
+    </w:p>
+    <w:p>
+      <w:pPr>
+        <w:spacing w:after="0"/>
+        <w:rPr>
+          <w:rFonts w:ascii="Arial" w:hAnsi="Arial" w:cs="Arial"/>
+          <w:lang w:val="pt-BR"/>
+        </w:rPr>
+      </w:pPr>
+    </w:p>
+    <w:p>
+      <w:pPr>
+        <w:spacing w:after="0"/>
+        <w:rPr>
+          <w:rFonts w:ascii="Arial" w:hAnsi="Arial" w:cs="Arial"/>
+          <w:lang w:val="pt-BR"/>
+        </w:rPr>
+      </w:pPr>
+    </w:p>
+    <w:p>
+      <w:pPr>
+        <w:spacing w:after="0"/>
+        <w:rPr>
+          <w:rFonts w:ascii="Arial" w:hAnsi="Arial" w:cs="Arial"/>
+          <w:lang w:val="pt-BR"/>
+        </w:rPr>
+      </w:pPr>
+    </w:p>
+    <w:p>
+      <w:pPr>
+        <w:spacing w:after="0"/>
+        <w:rPr>
+          <w:rFonts w:ascii="Arial" w:hAnsi="Arial" w:cs="Arial"/>
+          <w:lang w:val="pt-BR"/>
+        </w:rPr>
+      </w:pPr>
+    </w:p>
+    <w:p>
+      <w:pPr>
+        <w:spacing w:after="0"/>
+        <w:rPr>
+          <w:rFonts w:ascii="Arial" w:hAnsi="Arial" w:cs="Arial"/>
+          <w:lang w:val="pt-BR"/>
+        </w:rPr>
+      </w:pPr>
+    </w:p>
+    <w:p>
+      <w:pPr>
+        <w:spacing w:after="0"/>
+        <w:rPr>
+          <w:rFonts w:ascii="Arial" w:hAnsi="Arial" w:cs="Arial"/>
+          <w:lang w:val="pt-BR"/>
+        </w:rPr>
+      </w:pPr>
+    </w:p>
+    <w:p>
+      <w:pPr>
+        <w:spacing w:after="0"/>
+        <w:rPr>
+          <w:rFonts w:ascii="Arial" w:hAnsi="Arial" w:cs="Arial"/>
+          <w:lang w:val="pt-BR"/>
+        </w:rPr>
+      </w:pPr>
+    </w:p>
+    <w:p>
+      <w:pPr>
+        <w:spacing w:after="0"/>
+        <w:rPr>
+          <w:rFonts w:ascii="Arial" w:hAnsi="Arial" w:cs="Arial"/>
+          <w:lang w:val="pt-BR"/>
+        </w:rPr>
+      </w:pPr>
+      <w:r>
+        <w:rPr>
+          <w:rFonts w:ascii="Arial" w:hAnsi="Arial" w:cs="Arial"/>
+          <w:b/>
+          <w:lang w:val="pt-BR"/>
+        </w:rPr>
+        <w:lastRenderedPageBreak/>
+        <w:t>Semana 5 (16/03 – 22/03)</w:t>
+      </w:r>
+    </w:p>
+    <w:p>
+      <w:pPr>
+        <w:spacing w:after="0"/>
+        <w:rPr>
+          <w:rFonts w:ascii="Arial" w:hAnsi="Arial" w:cs="Arial"/>
+          <w:lang w:val="pt-BR"/>
+        </w:rPr>
+      </w:pPr>
+    </w:p>
+    <w:p>
+      <w:pPr>
+        <w:spacing w:after="0"/>
+        <w:rPr>
+          <w:rFonts w:ascii="Arial" w:hAnsi="Arial" w:cs="Arial"/>
+          <w:lang w:val="pt-BR"/>
+        </w:rPr>
+      </w:pPr>
+      <w:r>
+        <w:rPr>
+          <w:rFonts w:ascii="Arial" w:hAnsi="Arial" w:cs="Arial"/>
+          <w:lang w:val="pt-BR"/>
+        </w:rPr>
+        <w:t>Total de Horas Dedicadas: 12 horas</w:t>
+      </w:r>
+    </w:p>
+    <w:p>
+      <w:pPr>
+        <w:spacing w:after="0"/>
+        <w:rPr>
+          <w:rFonts w:ascii="Arial" w:hAnsi="Arial" w:cs="Arial"/>
+          <w:lang w:val="pt-BR"/>
+        </w:rPr>
+      </w:pPr>
+    </w:p>
+    <w:p>
+      <w:pPr>
+        <w:spacing w:after="0"/>
+        <w:rPr>
+          <w:rFonts w:ascii="Arial" w:hAnsi="Arial" w:cs="Arial"/>
+          <w:lang w:val="pt-BR"/>
+        </w:rPr>
+      </w:pPr>
+      <w:r>
+        <w:rPr>
+          <w:rFonts w:ascii="Arial" w:hAnsi="Arial" w:cs="Arial"/>
+          <w:b/>
+          <w:lang w:val="pt-BR"/>
+        </w:rPr>
+        <w:t>Atividades Realizadas:</w:t>
+      </w:r>
+    </w:p>
+    <w:p>
+      <w:pPr>
+        <w:spacing w:after="0"/>
+        <w:rPr>
+          <w:rFonts w:ascii="Arial" w:hAnsi="Arial" w:cs="Arial"/>
+          <w:lang w:val="pt-BR"/>
+        </w:rPr>
+      </w:pPr>
+    </w:p>
+    <w:p>
+      <w:pPr>
+        <w:spacing w:after="0"/>
+        <w:rPr>
+          <w:rFonts w:ascii="Arial" w:hAnsi="Arial" w:cs="Arial"/>
+          <w:lang w:val="pt-BR"/>
+        </w:rPr>
+      </w:pPr>
+      <w:r>
+        <w:rPr>
+          <w:rFonts w:ascii="Arial" w:hAnsi="Arial" w:cs="Arial"/>
+          <w:lang w:val="pt-BR"/>
+        </w:rPr>
+        <w:t>Definição de requisitos funcionais</w:t>
+      </w:r>
+    </w:p>
+    <w:p>
+      <w:pPr>
+        <w:spacing w:after="0"/>
+        <w:rPr>
+          <w:rFonts w:ascii="Arial" w:hAnsi="Arial" w:cs="Arial"/>
+          <w:lang w:val="pt-BR"/>
+        </w:rPr>
+      </w:pPr>
+      <w:r>
+        <w:rPr>
+          <w:rFonts w:ascii="Arial" w:hAnsi="Arial" w:cs="Arial"/>
+          <w:lang w:val="pt-BR"/>
+        </w:rPr>
+        <w:t>Definição de requisitos não funcionais</w:t>
+      </w:r>
+    </w:p>
+    <w:p>
+      <w:pPr>
+        <w:spacing w:after="0"/>
+        <w:rPr>
+          <w:rFonts w:ascii="Arial" w:hAnsi="Arial" w:cs="Arial"/>
+          <w:lang w:val="pt-BR"/>
+        </w:rPr>
+      </w:pPr>
+      <w:r>
+        <w:rPr>
+          <w:rFonts w:ascii="Arial" w:hAnsi="Arial" w:cs="Arial"/>
+          <w:lang w:val="pt-BR"/>
+        </w:rPr>
+        <w:t>Estruturação do backlog do MVP</w:t>
+      </w:r>
+    </w:p>
+    <w:p>
+      <w:pPr>
+        <w:spacing w:after="0"/>
+        <w:rPr>
+          <w:rFonts w:ascii="Arial" w:hAnsi="Arial" w:cs="Arial"/>
+          <w:lang w:val="pt-BR"/>
+        </w:rPr>
+      </w:pPr>
+      <w:r>
+        <w:rPr>
+          <w:rFonts w:ascii="Arial" w:hAnsi="Arial" w:cs="Arial"/>
+          <w:lang w:val="pt-BR"/>
+        </w:rPr>
+        <w:t>Definição de critérios de aceite das funcionalidades</w:t>
+      </w:r>
+    </w:p>
+    <w:p>
+      <w:pPr>
+        <w:spacing w:after="0"/>
+        <w:rPr>
+          <w:rFonts w:ascii="Arial" w:hAnsi="Arial" w:cs="Arial"/>
+          <w:lang w:val="pt-BR"/>
+        </w:rPr>
+      </w:pPr>
+    </w:p>
+    <w:p>
+      <w:pPr>
+        <w:spacing w:after="0"/>
+        <w:rPr>
+          <w:rFonts w:ascii="Arial" w:hAnsi="Arial" w:cs="Arial"/>
+          <w:lang w:val="pt-BR"/>
+        </w:rPr>
+      </w:pPr>
+    </w:p>
+    <w:p>
+      <w:pPr>
+        <w:spacing w:after="0"/>
+        <w:rPr>
+          <w:rFonts w:ascii="Arial" w:hAnsi="Arial" w:cs="Arial"/>
+          <w:lang w:val="pt-BR"/>
+        </w:rPr>
+      </w:pPr>
+      <w:r>
+        <w:rPr>
+          <w:rFonts w:ascii="Arial" w:hAnsi="Arial" w:cs="Arial"/>
+          <w:b/>
+          <w:lang w:val="pt-BR"/>
+        </w:rPr>
+        <w:t>Avanços do projeto:</w:t>
+      </w:r>
+    </w:p>
+    <w:p>
+      <w:pPr>
+        <w:spacing w:after="0"/>
+        <w:rPr>
+          <w:rFonts w:ascii="Arial" w:hAnsi="Arial" w:cs="Arial"/>
+          <w:lang w:val="pt-BR"/>
+        </w:rPr>
+      </w:pPr>
+    </w:p>
+    <w:p>
+      <w:pPr>
+        <w:spacing w:after="0"/>
+        <w:rPr>
+          <w:rFonts w:ascii="Arial" w:hAnsi="Arial" w:cs="Arial"/>
+          <w:lang w:val="pt-BR"/>
+        </w:rPr>
+      </w:pPr>
+      <w:r>
+        <w:rPr>
+          <w:rFonts w:ascii="Arial" w:hAnsi="Arial" w:cs="Arial"/>
+          <w:lang w:val="pt-BR"/>
+        </w:rPr>
+        <w:t>Definição clara das funcionalidades essenciais do sistema, organização das prioridades do MVP e estabelecimento de critérios objetivos para validação das entregas.</w:t>
+      </w:r>
+    </w:p>
+    <w:p>
+      <w:pPr>
+        <w:rPr>
+          <w:rFonts w:ascii="Arial" w:hAnsi="Arial" w:cs="Arial"/>
+          <w:lang w:val="pt-BR"/>
+        </w:rPr>
+      </w:pPr>
+    </w:p>
+    <w:p>
+      <w:pPr>
+        <w:spacing w:after="0"/>
+        <w:rPr>
+          <w:rFonts w:ascii="Arial" w:hAnsi="Arial" w:cs="Arial"/>
+          <w:lang w:val="pt-BR"/>
+        </w:rPr>
+      </w:pPr>
+      <w:r>
+        <w:rPr>
+          <w:rFonts w:ascii="Arial" w:hAnsi="Arial" w:cs="Arial"/>
+          <w:b/>
+          <w:lang w:val="pt-BR"/>
+        </w:rPr>
+        <w:t>Semana 6 (23/03 – 29/03)</w:t>
+      </w:r>
+    </w:p>
+    <w:p>
+      <w:pPr>
+        <w:spacing w:after="0"/>
+        <w:rPr>
+          <w:rFonts w:ascii="Arial" w:hAnsi="Arial" w:cs="Arial"/>
+          <w:lang w:val="pt-BR"/>
+        </w:rPr>
+      </w:pPr>
+    </w:p>
+    <w:p>
+      <w:pPr>
+        <w:spacing w:after="0"/>
+        <w:rPr>
+          <w:rFonts w:ascii="Arial" w:hAnsi="Arial" w:cs="Arial"/>
+          <w:lang w:val="pt-BR"/>
+        </w:rPr>
+      </w:pPr>
+      <w:r>
+        <w:rPr>
+          <w:rFonts w:ascii="Arial" w:hAnsi="Arial" w:cs="Arial"/>
+          <w:lang w:val="pt-BR"/>
+        </w:rPr>
+        <w:t>Total de Horas Dedicadas: 15 horas</w:t>
+      </w:r>
+    </w:p>
+    <w:p>
+      <w:pPr>
+        <w:spacing w:after="0"/>
+        <w:rPr>
+          <w:rFonts w:ascii="Arial" w:hAnsi="Arial" w:cs="Arial"/>
+          <w:lang w:val="pt-BR"/>
+        </w:rPr>
+      </w:pPr>
+    </w:p>
+    <w:p>
+      <w:pPr>
+        <w:spacing w:after="0"/>
+        <w:rPr>
+          <w:rFonts w:ascii="Arial" w:hAnsi="Arial" w:cs="Arial"/>
+          <w:lang w:val="pt-BR"/>
+        </w:rPr>
+      </w:pPr>
+      <w:r>
+        <w:rPr>
+          <w:rFonts w:ascii="Arial" w:hAnsi="Arial" w:cs="Arial"/>
+          <w:b/>
+          <w:lang w:val="pt-BR"/>
+        </w:rPr>
+        <w:t>Atividades Realizadas:</w:t>
+      </w:r>
+    </w:p>
+    <w:p>
+      <w:pPr>
+        <w:spacing w:after="0"/>
+        <w:rPr>
+          <w:rFonts w:ascii="Arial" w:hAnsi="Arial" w:cs="Arial"/>
+          <w:lang w:val="pt-BR"/>
+        </w:rPr>
+      </w:pPr>
+    </w:p>
+    <w:p>
+      <w:pPr>
+        <w:spacing w:after="0"/>
+        <w:rPr>
+          <w:rFonts w:ascii="Arial" w:hAnsi="Arial" w:cs="Arial"/>
+          <w:lang w:val="pt-BR"/>
+        </w:rPr>
+      </w:pPr>
+      <w:r>
+        <w:rPr>
+          <w:rFonts w:ascii="Arial" w:hAnsi="Arial" w:cs="Arial"/>
+          <w:lang w:val="pt-BR"/>
+        </w:rPr>
+        <w:t>Definição da arquitetura geral do sistema</w:t>
+      </w:r>
+    </w:p>
+    <w:p>
+      <w:pPr>
+        <w:spacing w:after="0"/>
+        <w:rPr>
+          <w:rFonts w:ascii="Arial" w:hAnsi="Arial" w:cs="Arial"/>
+          <w:lang w:val="pt-BR"/>
+        </w:rPr>
+      </w:pPr>
+      <w:r>
+        <w:rPr>
+          <w:rFonts w:ascii="Arial" w:hAnsi="Arial" w:cs="Arial"/>
+          <w:lang w:val="pt-BR"/>
+        </w:rPr>
+        <w:t xml:space="preserve">Escolha da </w:t>
+      </w:r>
+      <w:proofErr w:type="spellStart"/>
+      <w:r>
+        <w:rPr>
+          <w:rFonts w:ascii="Arial" w:hAnsi="Arial" w:cs="Arial"/>
+          <w:lang w:val="pt-BR"/>
+        </w:rPr>
+        <w:t>stack</w:t>
+      </w:r>
+      <w:proofErr w:type="spellEnd"/>
+      <w:r>
+        <w:rPr>
+          <w:rFonts w:ascii="Arial" w:hAnsi="Arial" w:cs="Arial"/>
+          <w:lang w:val="pt-BR"/>
+        </w:rPr>
+        <w:t xml:space="preserve"> tecnológica</w:t>
+      </w:r>
+    </w:p>
+    <w:p>
+      <w:pPr>
+        <w:spacing w:after="0"/>
+        <w:rPr>
+          <w:rFonts w:ascii="Arial" w:hAnsi="Arial" w:cs="Arial"/>
+          <w:lang w:val="pt-BR"/>
+        </w:rPr>
+      </w:pPr>
+      <w:r>
+        <w:rPr>
+          <w:rFonts w:ascii="Arial" w:hAnsi="Arial" w:cs="Arial"/>
+          <w:lang w:val="pt-BR"/>
+        </w:rPr>
+        <w:t>Estruturação inicial dos módulos</w:t>
+      </w:r>
+    </w:p>
+    <w:p>
+      <w:pPr>
+        <w:spacing w:after="0"/>
+        <w:rPr>
+          <w:rFonts w:ascii="Arial" w:hAnsi="Arial" w:cs="Arial"/>
+          <w:lang w:val="pt-BR"/>
+        </w:rPr>
+      </w:pPr>
+      <w:r>
+        <w:rPr>
+          <w:rFonts w:ascii="Arial" w:hAnsi="Arial" w:cs="Arial"/>
+          <w:lang w:val="pt-BR"/>
+        </w:rPr>
+        <w:t>Modelagem conceitual do banco de dados</w:t>
+      </w:r>
+    </w:p>
+    <w:p>
+      <w:pPr>
+        <w:spacing w:after="0"/>
+        <w:rPr>
+          <w:rFonts w:ascii="Arial" w:hAnsi="Arial" w:cs="Arial"/>
+          <w:lang w:val="pt-BR"/>
+        </w:rPr>
+      </w:pPr>
+    </w:p>
+    <w:p>
+      <w:pPr>
+        <w:spacing w:after="0"/>
+        <w:rPr>
+          <w:rFonts w:ascii="Arial" w:hAnsi="Arial" w:cs="Arial"/>
+          <w:lang w:val="pt-BR"/>
+        </w:rPr>
+      </w:pPr>
+      <w:r>
+        <w:rPr>
+          <w:rFonts w:ascii="Arial" w:hAnsi="Arial" w:cs="Arial"/>
+          <w:b/>
+          <w:lang w:val="pt-BR"/>
+        </w:rPr>
+        <w:t>Avanços do projeto:</w:t>
+      </w:r>
+    </w:p>
+    <w:p>
+      <w:pPr>
+        <w:spacing w:after="0"/>
+        <w:rPr>
+          <w:rFonts w:ascii="Arial" w:hAnsi="Arial" w:cs="Arial"/>
+          <w:lang w:val="pt-BR"/>
+        </w:rPr>
+      </w:pPr>
+    </w:p>
+    <w:p>
+      <w:pPr>
+        <w:spacing w:after="0"/>
+        <w:rPr>
+          <w:rFonts w:ascii="Arial" w:hAnsi="Arial" w:cs="Arial"/>
+          <w:lang w:val="pt-BR"/>
+        </w:rPr>
+      </w:pPr>
+      <w:r>
+        <w:rPr>
+          <w:rFonts w:ascii="Arial" w:hAnsi="Arial" w:cs="Arial"/>
+          <w:lang w:val="pt-BR"/>
+        </w:rPr>
+        <w:t>Consolidação da base técnica do projeto, com definição da arquitetura, tecnologias, organização modular e estrutura inicial dos dados.</w:t>
+      </w:r>
     </w:p>
     <w:sectPr>
       <w:pgSz w:w="12240" w:h="15840"/>
@@ -401,6 +1621,232 @@
       </w:pPr>
       <w:rPr>
         <w:rFonts w:ascii="Symbol" w:hAnsi="Symbol" w:hint="default"/>
+      </w:rPr>
+    </w:lvl>
+  </w:abstractNum>
+  <w:abstractNum w:abstractNumId="9" w15:restartNumberingAfterBreak="0">
+    <w:nsid w:val="092E55DB"/>
+    <w:multiLevelType w:val="hybridMultilevel"/>
+    <w:tmpl w:val="17E88D2E"/>
+    <w:lvl w:ilvl="0" w:tplc="04160001">
+      <w:start w:val="1"/>
+      <w:numFmt w:val="bullet"/>
+      <w:lvlText w:val=""/>
+      <w:lvlJc w:val="left"/>
+      <w:pPr>
+        <w:ind w:left="720" w:hanging="360"/>
+      </w:pPr>
+      <w:rPr>
+        <w:rFonts w:ascii="Symbol" w:hAnsi="Symbol" w:hint="default"/>
+      </w:rPr>
+    </w:lvl>
+    <w:lvl w:ilvl="1" w:tplc="04160003" w:tentative="1">
+      <w:start w:val="1"/>
+      <w:numFmt w:val="bullet"/>
+      <w:lvlText w:val="o"/>
+      <w:lvlJc w:val="left"/>
+      <w:pPr>
+        <w:ind w:left="1440" w:hanging="360"/>
+      </w:pPr>
+      <w:rPr>
+        <w:rFonts w:ascii="Courier New" w:hAnsi="Courier New" w:cs="Courier New" w:hint="default"/>
+      </w:rPr>
+    </w:lvl>
+    <w:lvl w:ilvl="2" w:tplc="04160005" w:tentative="1">
+      <w:start w:val="1"/>
+      <w:numFmt w:val="bullet"/>
+      <w:lvlText w:val=""/>
+      <w:lvlJc w:val="left"/>
+      <w:pPr>
+        <w:ind w:left="2160" w:hanging="360"/>
+      </w:pPr>
+      <w:rPr>
+        <w:rFonts w:ascii="Wingdings" w:hAnsi="Wingdings" w:hint="default"/>
+      </w:rPr>
+    </w:lvl>
+    <w:lvl w:ilvl="3" w:tplc="04160001" w:tentative="1">
+      <w:start w:val="1"/>
+      <w:numFmt w:val="bullet"/>
+      <w:lvlText w:val=""/>
+      <w:lvlJc w:val="left"/>
+      <w:pPr>
+        <w:ind w:left="2880" w:hanging="360"/>
+      </w:pPr>
+      <w:rPr>
+        <w:rFonts w:ascii="Symbol" w:hAnsi="Symbol" w:hint="default"/>
+      </w:rPr>
+    </w:lvl>
+    <w:lvl w:ilvl="4" w:tplc="04160003" w:tentative="1">
+      <w:start w:val="1"/>
+      <w:numFmt w:val="bullet"/>
+      <w:lvlText w:val="o"/>
+      <w:lvlJc w:val="left"/>
+      <w:pPr>
+        <w:ind w:left="3600" w:hanging="360"/>
+      </w:pPr>
+      <w:rPr>
+        <w:rFonts w:ascii="Courier New" w:hAnsi="Courier New" w:cs="Courier New" w:hint="default"/>
+      </w:rPr>
+    </w:lvl>
+    <w:lvl w:ilvl="5" w:tplc="04160005" w:tentative="1">
+      <w:start w:val="1"/>
+      <w:numFmt w:val="bullet"/>
+      <w:lvlText w:val=""/>
+      <w:lvlJc w:val="left"/>
+      <w:pPr>
+        <w:ind w:left="4320" w:hanging="360"/>
+      </w:pPr>
+      <w:rPr>
+        <w:rFonts w:ascii="Wingdings" w:hAnsi="Wingdings" w:hint="default"/>
+      </w:rPr>
+    </w:lvl>
+    <w:lvl w:ilvl="6" w:tplc="04160001" w:tentative="1">
+      <w:start w:val="1"/>
+      <w:numFmt w:val="bullet"/>
+      <w:lvlText w:val=""/>
+      <w:lvlJc w:val="left"/>
+      <w:pPr>
+        <w:ind w:left="5040" w:hanging="360"/>
+      </w:pPr>
+      <w:rPr>
+        <w:rFonts w:ascii="Symbol" w:hAnsi="Symbol" w:hint="default"/>
+      </w:rPr>
+    </w:lvl>
+    <w:lvl w:ilvl="7" w:tplc="04160003" w:tentative="1">
+      <w:start w:val="1"/>
+      <w:numFmt w:val="bullet"/>
+      <w:lvlText w:val="o"/>
+      <w:lvlJc w:val="left"/>
+      <w:pPr>
+        <w:ind w:left="5760" w:hanging="360"/>
+      </w:pPr>
+      <w:rPr>
+        <w:rFonts w:ascii="Courier New" w:hAnsi="Courier New" w:cs="Courier New" w:hint="default"/>
+      </w:rPr>
+    </w:lvl>
+    <w:lvl w:ilvl="8" w:tplc="04160005" w:tentative="1">
+      <w:start w:val="1"/>
+      <w:numFmt w:val="bullet"/>
+      <w:lvlText w:val=""/>
+      <w:lvlJc w:val="left"/>
+      <w:pPr>
+        <w:ind w:left="6480" w:hanging="360"/>
+      </w:pPr>
+      <w:rPr>
+        <w:rFonts w:ascii="Wingdings" w:hAnsi="Wingdings" w:hint="default"/>
+      </w:rPr>
+    </w:lvl>
+  </w:abstractNum>
+  <w:abstractNum w:abstractNumId="10" w15:restartNumberingAfterBreak="0">
+    <w:nsid w:val="4E346672"/>
+    <w:multiLevelType w:val="hybridMultilevel"/>
+    <w:tmpl w:val="CB9EF21A"/>
+    <w:lvl w:ilvl="0" w:tplc="04160001">
+      <w:start w:val="1"/>
+      <w:numFmt w:val="bullet"/>
+      <w:lvlText w:val=""/>
+      <w:lvlJc w:val="left"/>
+      <w:pPr>
+        <w:ind w:left="720" w:hanging="360"/>
+      </w:pPr>
+      <w:rPr>
+        <w:rFonts w:ascii="Symbol" w:hAnsi="Symbol" w:hint="default"/>
+      </w:rPr>
+    </w:lvl>
+    <w:lvl w:ilvl="1" w:tplc="04160003" w:tentative="1">
+      <w:start w:val="1"/>
+      <w:numFmt w:val="bullet"/>
+      <w:lvlText w:val="o"/>
+      <w:lvlJc w:val="left"/>
+      <w:pPr>
+        <w:ind w:left="1440" w:hanging="360"/>
+      </w:pPr>
+      <w:rPr>
+        <w:rFonts w:ascii="Courier New" w:hAnsi="Courier New" w:cs="Courier New" w:hint="default"/>
+      </w:rPr>
+    </w:lvl>
+    <w:lvl w:ilvl="2" w:tplc="04160005" w:tentative="1">
+      <w:start w:val="1"/>
+      <w:numFmt w:val="bullet"/>
+      <w:lvlText w:val=""/>
+      <w:lvlJc w:val="left"/>
+      <w:pPr>
+        <w:ind w:left="2160" w:hanging="360"/>
+      </w:pPr>
+      <w:rPr>
+        <w:rFonts w:ascii="Wingdings" w:hAnsi="Wingdings" w:hint="default"/>
+      </w:rPr>
+    </w:lvl>
+    <w:lvl w:ilvl="3" w:tplc="04160001" w:tentative="1">
+      <w:start w:val="1"/>
+      <w:numFmt w:val="bullet"/>
+      <w:lvlText w:val=""/>
+      <w:lvlJc w:val="left"/>
+      <w:pPr>
+        <w:ind w:left="2880" w:hanging="360"/>
+      </w:pPr>
+      <w:rPr>
+        <w:rFonts w:ascii="Symbol" w:hAnsi="Symbol" w:hint="default"/>
+      </w:rPr>
+    </w:lvl>
+    <w:lvl w:ilvl="4" w:tplc="04160003" w:tentative="1">
+      <w:start w:val="1"/>
+      <w:numFmt w:val="bullet"/>
+      <w:lvlText w:val="o"/>
+      <w:lvlJc w:val="left"/>
+      <w:pPr>
+        <w:ind w:left="3600" w:hanging="360"/>
+      </w:pPr>
+      <w:rPr>
+        <w:rFonts w:ascii="Courier New" w:hAnsi="Courier New" w:cs="Courier New" w:hint="default"/>
+      </w:rPr>
+    </w:lvl>
+    <w:lvl w:ilvl="5" w:tplc="04160005" w:tentative="1">
+      <w:start w:val="1"/>
+      <w:numFmt w:val="bullet"/>
+      <w:lvlText w:val=""/>
+      <w:lvlJc w:val="left"/>
+      <w:pPr>
+        <w:ind w:left="4320" w:hanging="360"/>
+      </w:pPr>
+      <w:rPr>
+        <w:rFonts w:ascii="Wingdings" w:hAnsi="Wingdings" w:hint="default"/>
+      </w:rPr>
+    </w:lvl>
+    <w:lvl w:ilvl="6" w:tplc="04160001" w:tentative="1">
+      <w:start w:val="1"/>
+      <w:numFmt w:val="bullet"/>
+      <w:lvlText w:val=""/>
+      <w:lvlJc w:val="left"/>
+      <w:pPr>
+        <w:ind w:left="5040" w:hanging="360"/>
+      </w:pPr>
+      <w:rPr>
+        <w:rFonts w:ascii="Symbol" w:hAnsi="Symbol" w:hint="default"/>
+      </w:rPr>
+    </w:lvl>
+    <w:lvl w:ilvl="7" w:tplc="04160003" w:tentative="1">
+      <w:start w:val="1"/>
+      <w:numFmt w:val="bullet"/>
+      <w:lvlText w:val="o"/>
+      <w:lvlJc w:val="left"/>
+      <w:pPr>
+        <w:ind w:left="5760" w:hanging="360"/>
+      </w:pPr>
+      <w:rPr>
+        <w:rFonts w:ascii="Courier New" w:hAnsi="Courier New" w:cs="Courier New" w:hint="default"/>
+      </w:rPr>
+    </w:lvl>
+    <w:lvl w:ilvl="8" w:tplc="04160005" w:tentative="1">
+      <w:start w:val="1"/>
+      <w:numFmt w:val="bullet"/>
+      <w:lvlText w:val=""/>
+      <w:lvlJc w:val="left"/>
+      <w:pPr>
+        <w:ind w:left="6480" w:hanging="360"/>
+      </w:pPr>
+      <w:rPr>
+        <w:rFonts w:ascii="Wingdings" w:hAnsi="Wingdings" w:hint="default"/>
       </w:rPr>
     </w:lvl>
   </w:abstractNum>
@@ -430,6 +1876,12 @@
   </w:num>
   <w:num w:numId="9" w16cid:durableId="1727751505">
     <w:abstractNumId w:val="0"/>
+  </w:num>
+  <w:num w:numId="10" w16cid:durableId="1196892675">
+    <w:abstractNumId w:val="9"/>
+  </w:num>
+  <w:num w:numId="11" w16cid:durableId="312415074">
+    <w:abstractNumId w:val="10"/>
   </w:num>
 </w:numbering>
 </file>
@@ -1037,6 +2489,7 @@
   <w:style w:type="character" w:default="1" w:styleId="Fontepargpadro">
     <w:name w:val="Default Paragraph Font"/>
     <w:uiPriority w:val="1"/>
+    <w:semiHidden/>
     <w:unhideWhenUsed/>
   </w:style>
   <w:style w:type="table" w:default="1" w:styleId="Tabelanormal">

</xml_diff>